<commit_message>
Aggiungi PEC e numeri protocollo pratica
</commit_message>
<xml_diff>
--- a/documenti_di_prova/documento_prova_anonimizzazione.docx
+++ b/documenti_di_prova/documento_prova_anonimizzazione.docx
@@ -3,822 +3,193 @@
 <w:document xmlns:wpc="http://schemas.microsoft.com/office/word/2010/wordprocessingCanvas" xmlns:mo="http://schemas.microsoft.com/office/mac/office/2008/main" xmlns:mc="http://schemas.openxmlformats.org/markup-compatibility/2006" xmlns:mv="urn:schemas-microsoft-com:mac:vml" xmlns:o="urn:schemas-microsoft-com:office:office" xmlns:r="http://schemas.openxmlformats.org/officeDocument/2006/relationships" xmlns:m="http://schemas.openxmlformats.org/officeDocument/2006/math" xmlns:v="urn:schemas-microsoft-com:vml" xmlns:wp14="http://schemas.microsoft.com/office/word/2010/wordprocessingDrawing" xmlns:wp="http://schemas.openxmlformats.org/drawingml/2006/wordprocessingDrawing" xmlns:w10="urn:schemas-microsoft-com:office:word" xmlns:w="http://schemas.openxmlformats.org/wordprocessingml/2006/main" xmlns:w14="http://schemas.microsoft.com/office/word/2010/wordml" xmlns:wpg="http://schemas.microsoft.com/office/word/2010/wordprocessingGroup" xmlns:wpi="http://schemas.microsoft.com/office/word/2010/wordprocessingInk" xmlns:wne="http://schemas.microsoft.com/office/word/2006/wordml" xmlns:wps="http://schemas.microsoft.com/office/word/2010/wordprocessingShape" mc:Ignorable="w14 wp14">
   <w:body>
     <w:p>
-      <w:pPr>
-        <w:spacing w:after="60"/>
-      </w:pPr>
       <w:r>
-        <w:rPr>
-          <w:rFonts w:ascii="Calibri" w:hAnsi="Calibri"/>
-          <w:b/>
-          <w:color w:val="0B2545"/>
-          <w:sz w:val="40"/>
-        </w:rPr>
-        <w:t>Documento di prova per anonimizzazione</w:t>
+        <w:t>DOCUMENTO DI PROVA - DATI FITTIZI</w:t>
+      </w:r>
+    </w:p>
+    <w:p/>
+    <w:p>
+      <w:r>
+        <w:t>Questo file contiene esclusivamente dati inventati per testare AI Data Anonymizer.</w:t>
       </w:r>
     </w:p>
     <w:p>
-      <w:pPr>
-        <w:spacing w:after="200"/>
-      </w:pPr>
       <w:r>
-        <w:rPr>
-          <w:i/>
-          <w:color w:val="555555"/>
-        </w:rPr>
-        <w:t>Dati interamente fittizi per testare AI Data Anonymizer</w:t>
+        <w:t>Non usare questi dati come informazioni reali.</w:t>
       </w:r>
     </w:p>
+    <w:p/>
     <w:p>
-      <w:pPr>
-        <w:spacing w:after="200"/>
-      </w:pPr>
       <w:r>
-        <w:rPr>
-          <w:b/>
-        </w:rPr>
-        <w:t xml:space="preserve">Nota: </w:t>
-      </w:r>
-      <w:r>
-        <w:t>questo documento non contiene dati reali. Serve solo per verificare il riconoscimento di dati personali e amministrativi italiani prima di condividere testi con strumenti IA.</w:t>
+        <w:t>Oggetto: bozza di incarico professionale e allegati amministrativi</w:t>
       </w:r>
     </w:p>
-    <w:p>
-      <w:pPr>
-        <w:pStyle w:val="Heading1"/>
-      </w:pPr>
-      <w:r>
-        <w:t>1. Bozza di incarico</w:t>
-      </w:r>
-    </w:p>
+    <w:p/>
     <w:p>
       <w:r>
         <w:t>Il sottoscritto Mario Rossi, nato a Roma il 10/01/1980 e residente in Via Appia 12, 00183 Roma, conferma di voler affidare un incarico di consulenza alla societa Alfa Beta S.r.l., con sede in Viale Europa 45, Milano.</w:t>
       </w:r>
     </w:p>
+    <w:p/>
+    <w:p>
+      <w:r>
+        <w:t>Dati anagrafici e di contatto del cliente:</w:t>
+      </w:r>
+    </w:p>
     <w:p>
       <w:pPr>
-        <w:pStyle w:val="Heading1"/>
+        <w:pStyle w:val="ListBullet"/>
       </w:pPr>
       <w:r>
-        <w:t>2. Dati anagrafici e di contatto</w:t>
+        <w:t>Nome: Mario Rossi</w:t>
       </w:r>
     </w:p>
-    <w:tbl>
-      <w:tblPr>
-        <w:tblW w:type="auto" w:w="0"/>
-        <w:jc w:val="center"/>
-        <w:tblLayout w:type="autofit"/>
-        <w:tblLook w:firstColumn="1" w:firstRow="1" w:lastColumn="0" w:lastRow="0" w:noHBand="0" w:noVBand="1" w:val="04A0"/>
-      </w:tblPr>
-      <w:tblGrid>
-        <w:gridCol w:w="4680"/>
-        <w:gridCol w:w="4680"/>
-      </w:tblGrid>
-      <w:tr>
-        <w:tc>
-          <w:tcPr>
-            <w:tcW w:type="dxa" w:w="4680"/>
-            <w:vAlign w:val="center"/>
-            <w:shd w:fill="F2F4F7"/>
-          </w:tcPr>
-          <w:p>
-            <w:pPr>
-              <w:spacing w:after="0"/>
-            </w:pPr>
-            <w:r/>
-            <w:r>
-              <w:rPr>
-                <w:rFonts w:ascii="Calibri" w:hAnsi="Calibri"/>
-                <w:b/>
-                <w:sz w:val="20"/>
-              </w:rPr>
-              <w:t>Campo</w:t>
-            </w:r>
-          </w:p>
-        </w:tc>
-        <w:tc>
-          <w:tcPr>
-            <w:tcW w:type="dxa" w:w="4680"/>
-            <w:vAlign w:val="center"/>
-            <w:shd w:fill="F2F4F7"/>
-          </w:tcPr>
-          <w:p>
-            <w:pPr>
-              <w:spacing w:after="0"/>
-            </w:pPr>
-            <w:r/>
-            <w:r>
-              <w:rPr>
-                <w:rFonts w:ascii="Calibri" w:hAnsi="Calibri"/>
-                <w:b/>
-                <w:sz w:val="20"/>
-              </w:rPr>
-              <w:t>Valore fittizio</w:t>
-            </w:r>
-          </w:p>
-        </w:tc>
-      </w:tr>
-      <w:tr>
-        <w:tc>
-          <w:tcPr>
-            <w:tcW w:type="dxa" w:w="4680"/>
-            <w:vAlign w:val="center"/>
-          </w:tcPr>
-          <w:p>
-            <w:pPr>
-              <w:spacing w:after="0"/>
-            </w:pPr>
-            <w:r/>
-            <w:r>
-              <w:rPr>
-                <w:rFonts w:ascii="Calibri" w:hAnsi="Calibri"/>
-                <w:b w:val="0"/>
-                <w:sz w:val="20"/>
-              </w:rPr>
-              <w:t>Nome cliente</w:t>
-            </w:r>
-          </w:p>
-        </w:tc>
-        <w:tc>
-          <w:tcPr>
-            <w:tcW w:type="dxa" w:w="4680"/>
-            <w:vAlign w:val="center"/>
-          </w:tcPr>
-          <w:p>
-            <w:pPr>
-              <w:spacing w:after="0"/>
-            </w:pPr>
-            <w:r/>
-            <w:r>
-              <w:rPr>
-                <w:rFonts w:ascii="Calibri" w:hAnsi="Calibri"/>
-                <w:b w:val="0"/>
-                <w:sz w:val="20"/>
-              </w:rPr>
-              <w:t>Mario Rossi</w:t>
-            </w:r>
-          </w:p>
-        </w:tc>
-      </w:tr>
-      <w:tr>
-        <w:tc>
-          <w:tcPr>
-            <w:tcW w:type="dxa" w:w="4680"/>
-            <w:vAlign w:val="center"/>
-          </w:tcPr>
-          <w:p>
-            <w:pPr>
-              <w:spacing w:after="0"/>
-            </w:pPr>
-            <w:r/>
-            <w:r>
-              <w:rPr>
-                <w:rFonts w:ascii="Calibri" w:hAnsi="Calibri"/>
-                <w:b w:val="0"/>
-                <w:sz w:val="20"/>
-              </w:rPr>
-              <w:t>Codice fiscale</w:t>
-            </w:r>
-          </w:p>
-        </w:tc>
-        <w:tc>
-          <w:tcPr>
-            <w:tcW w:type="dxa" w:w="4680"/>
-            <w:vAlign w:val="center"/>
-          </w:tcPr>
-          <w:p>
-            <w:pPr>
-              <w:spacing w:after="0"/>
-            </w:pPr>
-            <w:r/>
-            <w:r>
-              <w:rPr>
-                <w:rFonts w:ascii="Calibri" w:hAnsi="Calibri"/>
-                <w:b w:val="0"/>
-                <w:sz w:val="20"/>
-              </w:rPr>
-              <w:t>RSSMRA80A01H501U</w:t>
-            </w:r>
-          </w:p>
-        </w:tc>
-      </w:tr>
-      <w:tr>
-        <w:tc>
-          <w:tcPr>
-            <w:tcW w:type="dxa" w:w="4680"/>
-            <w:vAlign w:val="center"/>
-          </w:tcPr>
-          <w:p>
-            <w:pPr>
-              <w:spacing w:after="0"/>
-            </w:pPr>
-            <w:r/>
-            <w:r>
-              <w:rPr>
-                <w:rFonts w:ascii="Calibri" w:hAnsi="Calibri"/>
-                <w:b w:val="0"/>
-                <w:sz w:val="20"/>
-              </w:rPr>
-              <w:t>Email personale</w:t>
-            </w:r>
-          </w:p>
-        </w:tc>
-        <w:tc>
-          <w:tcPr>
-            <w:tcW w:type="dxa" w:w="4680"/>
-            <w:vAlign w:val="center"/>
-          </w:tcPr>
-          <w:p>
-            <w:pPr>
-              <w:spacing w:after="0"/>
-            </w:pPr>
-            <w:r/>
-            <w:r>
-              <w:rPr>
-                <w:rFonts w:ascii="Calibri" w:hAnsi="Calibri"/>
-                <w:b w:val="0"/>
-                <w:sz w:val="20"/>
-              </w:rPr>
-              <w:t>mario.rossi@example.com</w:t>
-            </w:r>
-          </w:p>
-        </w:tc>
-      </w:tr>
-      <w:tr>
-        <w:tc>
-          <w:tcPr>
-            <w:tcW w:type="dxa" w:w="4680"/>
-            <w:vAlign w:val="center"/>
-          </w:tcPr>
-          <w:p>
-            <w:pPr>
-              <w:spacing w:after="0"/>
-            </w:pPr>
-            <w:r/>
-            <w:r>
-              <w:rPr>
-                <w:rFonts w:ascii="Calibri" w:hAnsi="Calibri"/>
-                <w:b w:val="0"/>
-                <w:sz w:val="20"/>
-              </w:rPr>
-              <w:t>PEC</w:t>
-            </w:r>
-          </w:p>
-        </w:tc>
-        <w:tc>
-          <w:tcPr>
-            <w:tcW w:type="dxa" w:w="4680"/>
-            <w:vAlign w:val="center"/>
-          </w:tcPr>
-          <w:p>
-            <w:pPr>
-              <w:spacing w:after="0"/>
-            </w:pPr>
-            <w:r/>
-            <w:r>
-              <w:rPr>
-                <w:rFonts w:ascii="Calibri" w:hAnsi="Calibri"/>
-                <w:b w:val="0"/>
-                <w:sz w:val="20"/>
-              </w:rPr>
-              <w:t>mario.rossi@pec.example.com</w:t>
-            </w:r>
-          </w:p>
-        </w:tc>
-      </w:tr>
-      <w:tr>
-        <w:tc>
-          <w:tcPr>
-            <w:tcW w:type="dxa" w:w="4680"/>
-            <w:vAlign w:val="center"/>
-          </w:tcPr>
-          <w:p>
-            <w:pPr>
-              <w:spacing w:after="0"/>
-            </w:pPr>
-            <w:r/>
-            <w:r>
-              <w:rPr>
-                <w:rFonts w:ascii="Calibri" w:hAnsi="Calibri"/>
-                <w:b w:val="0"/>
-                <w:sz w:val="20"/>
-              </w:rPr>
-              <w:t>Telefono</w:t>
-            </w:r>
-          </w:p>
-        </w:tc>
-        <w:tc>
-          <w:tcPr>
-            <w:tcW w:type="dxa" w:w="4680"/>
-            <w:vAlign w:val="center"/>
-          </w:tcPr>
-          <w:p>
-            <w:pPr>
-              <w:spacing w:after="0"/>
-            </w:pPr>
-            <w:r/>
-            <w:r>
-              <w:rPr>
-                <w:rFonts w:ascii="Calibri" w:hAnsi="Calibri"/>
-                <w:b w:val="0"/>
-                <w:sz w:val="20"/>
-              </w:rPr>
-              <w:t>+39 333 123 4567</w:t>
-            </w:r>
-          </w:p>
-        </w:tc>
-      </w:tr>
-      <w:tr>
-        <w:tc>
-          <w:tcPr>
-            <w:tcW w:type="dxa" w:w="4680"/>
-            <w:vAlign w:val="center"/>
-          </w:tcPr>
-          <w:p>
-            <w:pPr>
-              <w:spacing w:after="0"/>
-            </w:pPr>
-            <w:r/>
-            <w:r>
-              <w:rPr>
-                <w:rFonts w:ascii="Calibri" w:hAnsi="Calibri"/>
-                <w:b w:val="0"/>
-                <w:sz w:val="20"/>
-              </w:rPr>
-              <w:t>Documento d'identita</w:t>
-            </w:r>
-          </w:p>
-        </w:tc>
-        <w:tc>
-          <w:tcPr>
-            <w:tcW w:type="dxa" w:w="4680"/>
-            <w:vAlign w:val="center"/>
-          </w:tcPr>
-          <w:p>
-            <w:pPr>
-              <w:spacing w:after="0"/>
-            </w:pPr>
-            <w:r/>
-            <w:r>
-              <w:rPr>
-                <w:rFonts w:ascii="Calibri" w:hAnsi="Calibri"/>
-                <w:b w:val="0"/>
-                <w:sz w:val="20"/>
-              </w:rPr>
-              <w:t>CA12345AA</w:t>
-            </w:r>
-          </w:p>
-        </w:tc>
-      </w:tr>
-      <w:tr>
-        <w:tc>
-          <w:tcPr>
-            <w:tcW w:type="dxa" w:w="4680"/>
-            <w:vAlign w:val="center"/>
-          </w:tcPr>
-          <w:p>
-            <w:pPr>
-              <w:spacing w:after="0"/>
-            </w:pPr>
-            <w:r/>
-            <w:r>
-              <w:rPr>
-                <w:rFonts w:ascii="Calibri" w:hAnsi="Calibri"/>
-                <w:b w:val="0"/>
-                <w:sz w:val="20"/>
-              </w:rPr>
-              <w:t>Passaporto</w:t>
-            </w:r>
-          </w:p>
-        </w:tc>
-        <w:tc>
-          <w:tcPr>
-            <w:tcW w:type="dxa" w:w="4680"/>
-            <w:vAlign w:val="center"/>
-          </w:tcPr>
-          <w:p>
-            <w:pPr>
-              <w:spacing w:after="0"/>
-            </w:pPr>
-            <w:r/>
-            <w:r>
-              <w:rPr>
-                <w:rFonts w:ascii="Calibri" w:hAnsi="Calibri"/>
-                <w:b w:val="0"/>
-                <w:sz w:val="20"/>
-              </w:rPr>
-              <w:t>YA1234567</w:t>
-            </w:r>
-          </w:p>
-        </w:tc>
-      </w:tr>
-      <w:tr>
-        <w:tc>
-          <w:tcPr>
-            <w:tcW w:type="dxa" w:w="4680"/>
-            <w:vAlign w:val="center"/>
-          </w:tcPr>
-          <w:p>
-            <w:pPr>
-              <w:spacing w:after="0"/>
-            </w:pPr>
-            <w:r/>
-            <w:r>
-              <w:rPr>
-                <w:rFonts w:ascii="Calibri" w:hAnsi="Calibri"/>
-                <w:b w:val="0"/>
-                <w:sz w:val="20"/>
-              </w:rPr>
-              <w:t>Patente</w:t>
-            </w:r>
-          </w:p>
-        </w:tc>
-        <w:tc>
-          <w:tcPr>
-            <w:tcW w:type="dxa" w:w="4680"/>
-            <w:vAlign w:val="center"/>
-          </w:tcPr>
-          <w:p>
-            <w:pPr>
-              <w:spacing w:after="0"/>
-            </w:pPr>
-            <w:r/>
-            <w:r>
-              <w:rPr>
-                <w:rFonts w:ascii="Calibri" w:hAnsi="Calibri"/>
-                <w:b w:val="0"/>
-                <w:sz w:val="20"/>
-              </w:rPr>
-              <w:t>U1234567A</w:t>
-            </w:r>
-          </w:p>
-        </w:tc>
-      </w:tr>
-      <w:tr>
-        <w:tc>
-          <w:tcPr>
-            <w:tcW w:type="dxa" w:w="4680"/>
-            <w:vAlign w:val="center"/>
-          </w:tcPr>
-          <w:p>
-            <w:pPr>
-              <w:spacing w:after="0"/>
-            </w:pPr>
-            <w:r/>
-            <w:r>
-              <w:rPr>
-                <w:rFonts w:ascii="Calibri" w:hAnsi="Calibri"/>
-                <w:b w:val="0"/>
-                <w:sz w:val="20"/>
-              </w:rPr>
-              <w:t>Tessera sanitaria</w:t>
-            </w:r>
-          </w:p>
-        </w:tc>
-        <w:tc>
-          <w:tcPr>
-            <w:tcW w:type="dxa" w:w="4680"/>
-            <w:vAlign w:val="center"/>
-          </w:tcPr>
-          <w:p>
-            <w:pPr>
-              <w:spacing w:after="0"/>
-            </w:pPr>
-            <w:r/>
-            <w:r>
-              <w:rPr>
-                <w:rFonts w:ascii="Calibri" w:hAnsi="Calibri"/>
-                <w:b w:val="0"/>
-                <w:sz w:val="20"/>
-              </w:rPr>
-              <w:t>8038 0000 0000 0000 0000</w:t>
-            </w:r>
-          </w:p>
-        </w:tc>
-      </w:tr>
-    </w:tbl>
     <w:p>
       <w:pPr>
-        <w:pStyle w:val="Heading1"/>
+        <w:pStyle w:val="ListBullet"/>
       </w:pPr>
       <w:r>
-        <w:t>3. Dati amministrativi e di fatturazione</w:t>
+        <w:t>Codice fiscale: RSSMRA80A01H501U</w:t>
       </w:r>
     </w:p>
-    <w:tbl>
-      <w:tblPr>
-        <w:tblW w:type="auto" w:w="0"/>
-        <w:jc w:val="center"/>
-        <w:tblLayout w:type="autofit"/>
-        <w:tblLook w:firstColumn="1" w:firstRow="1" w:lastColumn="0" w:lastRow="0" w:noHBand="0" w:noVBand="1" w:val="04A0"/>
-      </w:tblPr>
-      <w:tblGrid>
-        <w:gridCol w:w="4680"/>
-        <w:gridCol w:w="4680"/>
-      </w:tblGrid>
-      <w:tr>
-        <w:tc>
-          <w:tcPr>
-            <w:tcW w:type="dxa" w:w="4680"/>
-            <w:vAlign w:val="center"/>
-            <w:shd w:fill="F2F4F7"/>
-          </w:tcPr>
-          <w:p>
-            <w:pPr>
-              <w:spacing w:after="0"/>
-            </w:pPr>
-            <w:r/>
-            <w:r>
-              <w:rPr>
-                <w:rFonts w:ascii="Calibri" w:hAnsi="Calibri"/>
-                <w:b/>
-                <w:sz w:val="20"/>
-              </w:rPr>
-              <w:t>Campo</w:t>
-            </w:r>
-          </w:p>
-        </w:tc>
-        <w:tc>
-          <w:tcPr>
-            <w:tcW w:type="dxa" w:w="4680"/>
-            <w:vAlign w:val="center"/>
-            <w:shd w:fill="F2F4F7"/>
-          </w:tcPr>
-          <w:p>
-            <w:pPr>
-              <w:spacing w:after="0"/>
-            </w:pPr>
-            <w:r/>
-            <w:r>
-              <w:rPr>
-                <w:rFonts w:ascii="Calibri" w:hAnsi="Calibri"/>
-                <w:b/>
-                <w:sz w:val="20"/>
-              </w:rPr>
-              <w:t>Valore fittizio</w:t>
-            </w:r>
-          </w:p>
-        </w:tc>
-      </w:tr>
-      <w:tr>
-        <w:tc>
-          <w:tcPr>
-            <w:tcW w:type="dxa" w:w="4680"/>
-            <w:vAlign w:val="center"/>
-          </w:tcPr>
-          <w:p>
-            <w:pPr>
-              <w:spacing w:after="0"/>
-            </w:pPr>
-            <w:r/>
-            <w:r>
-              <w:rPr>
-                <w:rFonts w:ascii="Calibri" w:hAnsi="Calibri"/>
-                <w:b w:val="0"/>
-                <w:sz w:val="20"/>
-              </w:rPr>
-              <w:t>Ragione sociale</w:t>
-            </w:r>
-          </w:p>
-        </w:tc>
-        <w:tc>
-          <w:tcPr>
-            <w:tcW w:type="dxa" w:w="4680"/>
-            <w:vAlign w:val="center"/>
-          </w:tcPr>
-          <w:p>
-            <w:pPr>
-              <w:spacing w:after="0"/>
-            </w:pPr>
-            <w:r/>
-            <w:r>
-              <w:rPr>
-                <w:rFonts w:ascii="Calibri" w:hAnsi="Calibri"/>
-                <w:b w:val="0"/>
-                <w:sz w:val="20"/>
-              </w:rPr>
-              <w:t>Alfa Beta S.r.l.</w:t>
-            </w:r>
-          </w:p>
-        </w:tc>
-      </w:tr>
-      <w:tr>
-        <w:tc>
-          <w:tcPr>
-            <w:tcW w:type="dxa" w:w="4680"/>
-            <w:vAlign w:val="center"/>
-          </w:tcPr>
-          <w:p>
-            <w:pPr>
-              <w:spacing w:after="0"/>
-            </w:pPr>
-            <w:r/>
-            <w:r>
-              <w:rPr>
-                <w:rFonts w:ascii="Calibri" w:hAnsi="Calibri"/>
-                <w:b w:val="0"/>
-                <w:sz w:val="20"/>
-              </w:rPr>
-              <w:t>Partita IVA</w:t>
-            </w:r>
-          </w:p>
-        </w:tc>
-        <w:tc>
-          <w:tcPr>
-            <w:tcW w:type="dxa" w:w="4680"/>
-            <w:vAlign w:val="center"/>
-          </w:tcPr>
-          <w:p>
-            <w:pPr>
-              <w:spacing w:after="0"/>
-            </w:pPr>
-            <w:r/>
-            <w:r>
-              <w:rPr>
-                <w:rFonts w:ascii="Calibri" w:hAnsi="Calibri"/>
-                <w:b w:val="0"/>
-                <w:sz w:val="20"/>
-              </w:rPr>
-              <w:t>12345678903</w:t>
-            </w:r>
-          </w:p>
-        </w:tc>
-      </w:tr>
-      <w:tr>
-        <w:tc>
-          <w:tcPr>
-            <w:tcW w:type="dxa" w:w="4680"/>
-            <w:vAlign w:val="center"/>
-          </w:tcPr>
-          <w:p>
-            <w:pPr>
-              <w:spacing w:after="0"/>
-            </w:pPr>
-            <w:r/>
-            <w:r>
-              <w:rPr>
-                <w:rFonts w:ascii="Calibri" w:hAnsi="Calibri"/>
-                <w:b w:val="0"/>
-                <w:sz w:val="20"/>
-              </w:rPr>
-              <w:t>IBAN</w:t>
-            </w:r>
-          </w:p>
-        </w:tc>
-        <w:tc>
-          <w:tcPr>
-            <w:tcW w:type="dxa" w:w="4680"/>
-            <w:vAlign w:val="center"/>
-          </w:tcPr>
-          <w:p>
-            <w:pPr>
-              <w:spacing w:after="0"/>
-            </w:pPr>
-            <w:r/>
-            <w:r>
-              <w:rPr>
-                <w:rFonts w:ascii="Calibri" w:hAnsi="Calibri"/>
-                <w:b w:val="0"/>
-                <w:sz w:val="20"/>
-              </w:rPr>
-              <w:t>IT60 X054 2811 1010 0000 0123 456</w:t>
-            </w:r>
-          </w:p>
-        </w:tc>
-      </w:tr>
-      <w:tr>
-        <w:tc>
-          <w:tcPr>
-            <w:tcW w:type="dxa" w:w="4680"/>
-            <w:vAlign w:val="center"/>
-          </w:tcPr>
-          <w:p>
-            <w:pPr>
-              <w:spacing w:after="0"/>
-            </w:pPr>
-            <w:r/>
-            <w:r>
-              <w:rPr>
-                <w:rFonts w:ascii="Calibri" w:hAnsi="Calibri"/>
-                <w:b w:val="0"/>
-                <w:sz w:val="20"/>
-              </w:rPr>
-              <w:t>Codice destinatario SDI</w:t>
-            </w:r>
-          </w:p>
-        </w:tc>
-        <w:tc>
-          <w:tcPr>
-            <w:tcW w:type="dxa" w:w="4680"/>
-            <w:vAlign w:val="center"/>
-          </w:tcPr>
-          <w:p>
-            <w:pPr>
-              <w:spacing w:after="0"/>
-            </w:pPr>
-            <w:r/>
-            <w:r>
-              <w:rPr>
-                <w:rFonts w:ascii="Calibri" w:hAnsi="Calibri"/>
-                <w:b w:val="0"/>
-                <w:sz w:val="20"/>
-              </w:rPr>
-              <w:t>ABC1234</w:t>
-            </w:r>
-          </w:p>
-        </w:tc>
-      </w:tr>
-      <w:tr>
-        <w:tc>
-          <w:tcPr>
-            <w:tcW w:type="dxa" w:w="4680"/>
-            <w:vAlign w:val="center"/>
-          </w:tcPr>
-          <w:p>
-            <w:pPr>
-              <w:spacing w:after="0"/>
-            </w:pPr>
-            <w:r/>
-            <w:r>
-              <w:rPr>
-                <w:rFonts w:ascii="Calibri" w:hAnsi="Calibri"/>
-                <w:b w:val="0"/>
-                <w:sz w:val="20"/>
-              </w:rPr>
-              <w:t>Codice univoco ufficio</w:t>
-            </w:r>
-          </w:p>
-        </w:tc>
-        <w:tc>
-          <w:tcPr>
-            <w:tcW w:type="dxa" w:w="4680"/>
-            <w:vAlign w:val="center"/>
-          </w:tcPr>
-          <w:p>
-            <w:pPr>
-              <w:spacing w:after="0"/>
-            </w:pPr>
-            <w:r/>
-            <w:r>
-              <w:rPr>
-                <w:rFonts w:ascii="Calibri" w:hAnsi="Calibri"/>
-                <w:b w:val="0"/>
-                <w:sz w:val="20"/>
-              </w:rPr>
-              <w:t>A1B2C3</w:t>
-            </w:r>
-          </w:p>
-        </w:tc>
-      </w:tr>
-      <w:tr>
-        <w:tc>
-          <w:tcPr>
-            <w:tcW w:type="dxa" w:w="4680"/>
-            <w:vAlign w:val="center"/>
-          </w:tcPr>
-          <w:p>
-            <w:pPr>
-              <w:spacing w:after="0"/>
-            </w:pPr>
-            <w:r/>
-            <w:r>
-              <w:rPr>
-                <w:rFonts w:ascii="Calibri" w:hAnsi="Calibri"/>
-                <w:b w:val="0"/>
-                <w:sz w:val="20"/>
-              </w:rPr>
-              <w:t>Targa veicolo aziendale</w:t>
-            </w:r>
-          </w:p>
-        </w:tc>
-        <w:tc>
-          <w:tcPr>
-            <w:tcW w:type="dxa" w:w="4680"/>
-            <w:vAlign w:val="center"/>
-          </w:tcPr>
-          <w:p>
-            <w:pPr>
-              <w:spacing w:after="0"/>
-            </w:pPr>
-            <w:r/>
-            <w:r>
-              <w:rPr>
-                <w:rFonts w:ascii="Calibri" w:hAnsi="Calibri"/>
-                <w:b w:val="0"/>
-                <w:sz w:val="20"/>
-              </w:rPr>
-              <w:t>AB123CD</w:t>
-            </w:r>
-          </w:p>
-        </w:tc>
-      </w:tr>
-    </w:tbl>
     <w:p>
       <w:pPr>
-        <w:pStyle w:val="Heading1"/>
+        <w:pStyle w:val="ListBullet"/>
       </w:pPr>
       <w:r>
-        <w:t>4. Note operative</w:t>
+        <w:t>Email personale: mario.rossi@example.com</w:t>
+      </w:r>
+    </w:p>
+    <w:p>
+      <w:pPr>
+        <w:pStyle w:val="ListBullet"/>
+      </w:pPr>
+      <w:r>
+        <w:t>PEC: mario.rossi@pec.example.com</w:t>
+      </w:r>
+    </w:p>
+    <w:p>
+      <w:pPr>
+        <w:pStyle w:val="ListBullet"/>
+      </w:pPr>
+      <w:r>
+        <w:t>Telefono: +39 333 123 4567</w:t>
+      </w:r>
+    </w:p>
+    <w:p>
+      <w:pPr>
+        <w:pStyle w:val="ListBullet"/>
+      </w:pPr>
+      <w:r>
+        <w:t>Documento d'identita n. CA12345AA</w:t>
+      </w:r>
+    </w:p>
+    <w:p>
+      <w:pPr>
+        <w:pStyle w:val="ListBullet"/>
+      </w:pPr>
+      <w:r>
+        <w:t>Passaporto n. YA1234567</w:t>
+      </w:r>
+    </w:p>
+    <w:p>
+      <w:pPr>
+        <w:pStyle w:val="ListBullet"/>
+      </w:pPr>
+      <w:r>
+        <w:t>Patente n. U1234567A</w:t>
+      </w:r>
+    </w:p>
+    <w:p>
+      <w:pPr>
+        <w:pStyle w:val="ListBullet"/>
+      </w:pPr>
+      <w:r>
+        <w:t>Tessera sanitaria n. 8038 0000 0000 0000 0000</w:t>
+      </w:r>
+    </w:p>
+    <w:p/>
+    <w:p>
+      <w:r>
+        <w:t>Dati amministrativi e di fatturazione:</w:t>
+      </w:r>
+    </w:p>
+    <w:p>
+      <w:pPr>
+        <w:pStyle w:val="ListBullet"/>
+      </w:pPr>
+      <w:r>
+        <w:t>Ragione sociale: Alfa Beta S.r.l.</w:t>
+      </w:r>
+    </w:p>
+    <w:p>
+      <w:pPr>
+        <w:pStyle w:val="ListBullet"/>
+      </w:pPr>
+      <w:r>
+        <w:t>Partita IVA: 12345678903</w:t>
+      </w:r>
+    </w:p>
+    <w:p>
+      <w:pPr>
+        <w:pStyle w:val="ListBullet"/>
+      </w:pPr>
+      <w:r>
+        <w:t>IBAN: IT60 X054 2811 1010 0000 0123 456</w:t>
+      </w:r>
+    </w:p>
+    <w:p>
+      <w:pPr>
+        <w:pStyle w:val="ListBullet"/>
+      </w:pPr>
+      <w:r>
+        <w:t>Codice destinatario SDI: ABC1234</w:t>
+      </w:r>
+    </w:p>
+    <w:p>
+      <w:pPr>
+        <w:pStyle w:val="ListBullet"/>
+      </w:pPr>
+      <w:r>
+        <w:t>Codice univoco ufficio: A1B2C3</w:t>
+      </w:r>
+    </w:p>
+    <w:p>
+      <w:pPr>
+        <w:pStyle w:val="ListBullet"/>
+      </w:pPr>
+      <w:r>
+        <w:t>Targa veicolo aziendale: AB123CD</w:t>
+      </w:r>
+    </w:p>
+    <w:p>
+      <w:pPr>
+        <w:pStyle w:val="ListBullet"/>
+      </w:pPr>
+      <w:r>
+        <w:t>Protocollo n. 12345/2024</w:t>
+      </w:r>
+    </w:p>
+    <w:p>
+      <w:pPr>
+        <w:pStyle w:val="ListBullet"/>
+      </w:pPr>
+      <w:r>
+        <w:t>Numero pratica: ED 9901</w:t>
+      </w:r>
+    </w:p>
+    <w:p>
+      <w:pPr>
+        <w:pStyle w:val="ListBullet"/>
+      </w:pPr>
+      <w:r>
+        <w:t>Fascicolo RG 4567/2023</w:t>
+      </w:r>
+    </w:p>
+    <w:p/>
+    <w:p>
+      <w:r>
+        <w:t>Note operative:</w:t>
       </w:r>
     </w:p>
     <w:p>
@@ -831,65 +202,30 @@
         <w:t>La documentazione verra trasmessa al Comune di Roma e alla Provincia di Potenza entro il 5 maggio 2020.</w:t>
       </w:r>
     </w:p>
+    <w:p/>
     <w:p>
-      <w:pPr>
-        <w:pStyle w:val="Heading1"/>
-      </w:pPr>
       <w:r>
-        <w:t>5. Test di controllo</w:t>
+        <w:t>Test di controllo:</w:t>
       </w:r>
     </w:p>
     <w:p>
-      <w:pPr>
-        <w:pStyle w:val="ListBullet"/>
-      </w:pPr>
       <w:r>
         <w:t>La sigla ZZ999ZZ, se non accompagnata da una parola come targa, non dovrebbe essere anonimizzata.</w:t>
       </w:r>
     </w:p>
     <w:p>
-      <w:pPr>
-        <w:pStyle w:val="ListBullet"/>
-      </w:pPr>
       <w:r>
         <w:t>Il codice QWERTY1, se non accompagnato da codice SDI o codice destinatario, non dovrebbe essere anonimizzato.</w:t>
       </w:r>
     </w:p>
-    <w:p>
-      <w:pPr>
-        <w:pStyle w:val="ListBullet"/>
-      </w:pPr>
-      <w:r>
-        <w:t>Dopo l'anonimizzazione, rileggi sempre il risultato prima di usarlo in ChatGPT o altri servizi esterni.</w:t>
-      </w:r>
-    </w:p>
     <w:sectPr>
-      <w:footerReference w:type="default" r:id="rId9"/>
       <w:pgSz w:w="12240" w:h="15840"/>
-      <w:pgMar w:top="1440" w:right="1440" w:bottom="1440" w:left="1440" w:header="720" w:footer="720" w:gutter="0"/>
+      <w:pgMar w:top="1440" w:right="1800" w:bottom="1440" w:left="1800" w:header="720" w:footer="720" w:gutter="0"/>
       <w:cols w:space="720"/>
       <w:docGrid w:linePitch="360"/>
     </w:sectPr>
   </w:body>
 </w:document>
-</file>
-
-<file path=word/footer1.xml><?xml version="1.0" encoding="utf-8"?>
-<w:ftr xmlns:m="http://schemas.openxmlformats.org/officeDocument/2006/math" xmlns:mc="http://schemas.openxmlformats.org/markup-compatibility/2006" xmlns:mo="http://schemas.microsoft.com/office/mac/office/2008/main" xmlns:mv="urn:schemas-microsoft-com:mac:vml" xmlns:o="urn:schemas-microsoft-com:office:office" xmlns:r="http://schemas.openxmlformats.org/officeDocument/2006/relationships" xmlns:v="urn:schemas-microsoft-com:vml" xmlns:w10="urn:schemas-microsoft-com:office:word" xmlns:w14="http://schemas.microsoft.com/office/word/2010/wordml" xmlns:w="http://schemas.openxmlformats.org/wordprocessingml/2006/main" xmlns:wne="http://schemas.microsoft.com/office/word/2006/wordml" xmlns:wp14="http://schemas.microsoft.com/office/word/2010/wordprocessingDrawing" xmlns:wp="http://schemas.openxmlformats.org/drawingml/2006/wordprocessingDrawing" xmlns:wpc="http://schemas.microsoft.com/office/word/2010/wordprocessingCanvas" xmlns:wpg="http://schemas.microsoft.com/office/word/2010/wordprocessingGroup" xmlns:wpi="http://schemas.microsoft.com/office/word/2010/wordprocessingInk" xmlns:wps="http://schemas.microsoft.com/office/word/2010/wordprocessingShape" mc:Ignorable="w14 wp14">
-  <w:p>
-    <w:pPr>
-      <w:pStyle w:val="Footer"/>
-      <w:jc w:val="center"/>
-    </w:pPr>
-    <w:r>
-      <w:rPr>
-        <w:color w:val="555555"/>
-        <w:sz w:val="16"/>
-      </w:rPr>
-      <w:t>AI Data Anonymizer - documento di prova con dati fittizi</w:t>
-    </w:r>
-  </w:p>
-</w:ftr>
 </file>
 
 <file path=word/numbering.xml><?xml version="1.0" encoding="utf-8"?>
@@ -1255,13 +591,6 @@
     <w:name w:val="Normal"/>
     <w:qFormat/>
     <w:rsid w:val="00FC693F"/>
-    <w:pPr>
-      <w:spacing w:after="120" w:line="264" w:lineRule="auto"/>
-    </w:pPr>
-    <w:rPr>
-      <w:rFonts w:ascii="Calibri" w:hAnsi="Calibri"/>
-      <w:sz w:val="22"/>
-    </w:rPr>
   </w:style>
   <w:style w:type="paragraph" w:styleId="Header">
     <w:name w:val="header"/>
@@ -1318,15 +647,15 @@
     <w:pPr>
       <w:keepNext/>
       <w:keepLines/>
-      <w:spacing w:before="240" w:after="120"/>
+      <w:spacing w:before="480" w:after="0"/>
       <w:outlineLvl w:val="0"/>
     </w:pPr>
     <w:rPr>
-      <w:rFonts w:asciiTheme="majorHAnsi" w:eastAsiaTheme="majorEastAsia" w:hAnsiTheme="majorHAnsi" w:cstheme="majorBidi" w:ascii="Calibri" w:hAnsi="Calibri"/>
+      <w:rFonts w:asciiTheme="majorHAnsi" w:eastAsiaTheme="majorEastAsia" w:hAnsiTheme="majorHAnsi" w:cstheme="majorBidi"/>
       <w:b/>
       <w:bCs/>
-      <w:color w:val="2E74B5"/>
-      <w:sz w:val="32"/>
+      <w:color w:val="365F91" w:themeColor="accent1" w:themeShade="BF"/>
+      <w:sz w:val="28"/>
       <w:szCs w:val="28"/>
     </w:rPr>
   </w:style>
@@ -1342,14 +671,14 @@
     <w:pPr>
       <w:keepNext/>
       <w:keepLines/>
-      <w:spacing w:before="240" w:after="120"/>
+      <w:spacing w:before="200" w:after="0"/>
       <w:outlineLvl w:val="1"/>
     </w:pPr>
     <w:rPr>
-      <w:rFonts w:asciiTheme="majorHAnsi" w:eastAsiaTheme="majorEastAsia" w:hAnsiTheme="majorHAnsi" w:cstheme="majorBidi" w:ascii="Calibri" w:hAnsi="Calibri"/>
+      <w:rFonts w:asciiTheme="majorHAnsi" w:eastAsiaTheme="majorEastAsia" w:hAnsiTheme="majorHAnsi" w:cstheme="majorBidi"/>
       <w:b/>
       <w:bCs/>
-      <w:color w:val="2E74B5"/>
+      <w:color w:val="4F81BD" w:themeColor="accent1"/>
       <w:sz w:val="26"/>
       <w:szCs w:val="26"/>
     </w:rPr>

</xml_diff>